<commit_message>
Add resignation to the Employee workflow document
Co-Authored-By: Claude Opus 5.5 <noreply@anthropic.com>
Claude-Session: https://claude.ai/code/session_014AaYkgAav6gPmsQYWWenKe
</commit_message>
<xml_diff>
--- a/docs/journeys/HR-Portal-Employee-Workflow.docx
+++ b/docs/journeys/HR-Portal-Employee-Workflow.docx
@@ -41,7 +41,7 @@
         <w:spacing w:after="120"/>
       </w:pPr>
       <w:r>
-        <w:t xml:space="preserve">Everything an employee does in the portal: signing in for the first time, leave, attendance, payslips and documents. Each section below shows the module as a small flow diagram, then the exact steps: what to click and what you should see.</w:t>
+        <w:t xml:space="preserve">Everything an employee does in the portal: signing in for the first time, leave, attendance, payslips, documents and resignation. Each section below shows the module as a small flow diagram, then the exact steps: what to click and what you should see.</w:t>
       </w:r>
     </w:p>
     <w:p>
@@ -246,7 +246,15 @@
         <w:spacing w:after="40"/>
       </w:pPr>
       <w:r>
-        <w:t xml:space="preserve">8. Notifications, password and signing out</w:t>
+        <w:t xml:space="preserve">8. Resignation</w:t>
+      </w:r>
+    </w:p>
+    <w:p>
+      <w:pPr>
+        <w:spacing w:after="40"/>
+      </w:pPr>
+      <w:r>
+        <w:t xml:space="preserve">9. Notifications, password and signing out</w:t>
       </w:r>
     </w:p>
     <w:p>
@@ -4808,7 +4816,7 @@
         <w:pageBreakBefore/>
       </w:pPr>
       <w:r>
-        <w:t xml:space="preserve">8. Notifications, password and signing out</w:t>
+        <w:t xml:space="preserve">8. Resignation</w:t>
       </w:r>
     </w:p>
     <w:p>
@@ -4828,7 +4836,7 @@
         <w:t xml:space="preserve">Before you start:  </w:t>
       </w:r>
       <w:r>
-        <w:t xml:space="preserve">Nothing.</w:t>
+        <w:t xml:space="preserve">The last working day you would like and your reason for leaving.</w:t>
       </w:r>
     </w:p>
     <w:p>
@@ -4839,7 +4847,7 @@
       <w:r>
         <w:drawing>
           <wp:inline distT="0" distB="0" distL="0" distR="0">
-            <wp:extent cx="5715000" cy="4362450"/>
+            <wp:extent cx="5715000" cy="857250"/>
             <wp:effectExtent t="0" r="0" b="0" l="0"/>
             <wp:docPr id="8" name="" descr="" title=""/>
             <wp:cNvGraphicFramePr>
@@ -4856,6 +4864,930 @@
                   </pic:nvPicPr>
                   <pic:blipFill>
                     <a:blip r:embed="rId15" cstate="none"/>
+                    <a:srcRect/>
+                    <a:stretch>
+                      <a:fillRect/>
+                    </a:stretch>
+                  </pic:blipFill>
+                  <pic:spPr bwMode="auto">
+                    <a:xfrm>
+                      <a:off x="0" y="0"/>
+                      <a:ext cx="5715000" cy="857250"/>
+                    </a:xfrm>
+                    <a:prstGeom prst="rect">
+                      <a:avLst/>
+                    </a:prstGeom>
+                  </pic:spPr>
+                </pic:pic>
+              </a:graphicData>
+            </a:graphic>
+          </wp:inline>
+        </w:drawing>
+      </w:r>
+    </w:p>
+    <w:tbl>
+      <w:tblPr>
+        <w:tblW w:type="dxa" w:w="9026"/>
+        <w:tblBorders>
+          <w:top w:val="single" w:color="auto" w:sz="4"/>
+          <w:left w:val="single" w:color="auto" w:sz="4"/>
+          <w:bottom w:val="single" w:color="auto" w:sz="4"/>
+          <w:right w:val="single" w:color="auto" w:sz="4"/>
+          <w:insideH w:val="single" w:color="auto" w:sz="4"/>
+          <w:insideV w:val="single" w:color="auto" w:sz="4"/>
+        </w:tblBorders>
+      </w:tblPr>
+      <w:tblGrid>
+        <w:gridCol w:w="800"/>
+        <w:gridCol w:w="4700"/>
+        <w:gridCol w:w="3526"/>
+      </w:tblGrid>
+      <w:tr>
+        <w:trPr>
+          <w:tblHeader/>
+        </w:trPr>
+        <w:tc>
+          <w:tcPr>
+            <w:tcW w:type="dxa" w:w="800"/>
+            <w:tcBorders>
+              <w:top w:val="single" w:color="D0D7DE" w:sz="4"/>
+              <w:left w:val="single" w:color="D0D7DE" w:sz="4"/>
+              <w:bottom w:val="single" w:color="D0D7DE" w:sz="4"/>
+              <w:right w:val="single" w:color="D0D7DE" w:sz="4"/>
+            </w:tcBorders>
+            <w:shd w:fill="1F4E79" w:color="auto" w:val="clear"/>
+            <w:tcMar>
+              <w:top w:type="dxa" w:w="80"/>
+              <w:left w:type="dxa" w:w="110"/>
+              <w:bottom w:type="dxa" w:w="80"/>
+              <w:right w:type="dxa" w:w="110"/>
+            </w:tcMar>
+          </w:tcPr>
+          <w:p>
+            <w:pPr>
+              <w:jc w:val="center"/>
+            </w:pPr>
+            <w:r>
+              <w:rPr>
+                <w:b/>
+                <w:bCs/>
+                <w:color w:val="FFFFFF"/>
+                <w:sz w:val="20"/>
+                <w:szCs w:val="20"/>
+              </w:rPr>
+              <w:t xml:space="preserve">Step</w:t>
+            </w:r>
+          </w:p>
+        </w:tc>
+        <w:tc>
+          <w:tcPr>
+            <w:tcW w:type="dxa" w:w="4700"/>
+            <w:tcBorders>
+              <w:top w:val="single" w:color="D0D7DE" w:sz="4"/>
+              <w:left w:val="single" w:color="D0D7DE" w:sz="4"/>
+              <w:bottom w:val="single" w:color="D0D7DE" w:sz="4"/>
+              <w:right w:val="single" w:color="D0D7DE" w:sz="4"/>
+            </w:tcBorders>
+            <w:shd w:fill="1F4E79" w:color="auto" w:val="clear"/>
+            <w:tcMar>
+              <w:top w:type="dxa" w:w="80"/>
+              <w:left w:type="dxa" w:w="110"/>
+              <w:bottom w:type="dxa" w:w="80"/>
+              <w:right w:type="dxa" w:w="110"/>
+            </w:tcMar>
+          </w:tcPr>
+          <w:p>
+            <w:pPr>
+              <w:jc w:val="left"/>
+            </w:pPr>
+            <w:r>
+              <w:rPr>
+                <w:b/>
+                <w:bCs/>
+                <w:color w:val="FFFFFF"/>
+                <w:sz w:val="20"/>
+                <w:szCs w:val="20"/>
+              </w:rPr>
+              <w:t xml:space="preserve">What you do</w:t>
+            </w:r>
+          </w:p>
+        </w:tc>
+        <w:tc>
+          <w:tcPr>
+            <w:tcW w:type="dxa" w:w="3526"/>
+            <w:tcBorders>
+              <w:top w:val="single" w:color="D0D7DE" w:sz="4"/>
+              <w:left w:val="single" w:color="D0D7DE" w:sz="4"/>
+              <w:bottom w:val="single" w:color="D0D7DE" w:sz="4"/>
+              <w:right w:val="single" w:color="D0D7DE" w:sz="4"/>
+            </w:tcBorders>
+            <w:shd w:fill="1F4E79" w:color="auto" w:val="clear"/>
+            <w:tcMar>
+              <w:top w:type="dxa" w:w="80"/>
+              <w:left w:type="dxa" w:w="110"/>
+              <w:bottom w:type="dxa" w:w="80"/>
+              <w:right w:type="dxa" w:w="110"/>
+            </w:tcMar>
+          </w:tcPr>
+          <w:p>
+            <w:pPr>
+              <w:jc w:val="left"/>
+            </w:pPr>
+            <w:r>
+              <w:rPr>
+                <w:b/>
+                <w:bCs/>
+                <w:color w:val="FFFFFF"/>
+                <w:sz w:val="20"/>
+                <w:szCs w:val="20"/>
+              </w:rPr>
+              <w:t xml:space="preserve">What you see</w:t>
+            </w:r>
+          </w:p>
+        </w:tc>
+      </w:tr>
+      <w:tr>
+        <w:trPr>
+          <w:cantSplit/>
+        </w:trPr>
+        <w:tc>
+          <w:tcPr>
+            <w:tcW w:type="dxa" w:w="800"/>
+            <w:tcBorders>
+              <w:top w:val="single" w:color="D0D7DE" w:sz="4"/>
+              <w:left w:val="single" w:color="D0D7DE" w:sz="4"/>
+              <w:bottom w:val="single" w:color="D0D7DE" w:sz="4"/>
+              <w:right w:val="single" w:color="D0D7DE" w:sz="4"/>
+            </w:tcBorders>
+            <w:shd w:fill="FFFFFF" w:color="auto" w:val="clear"/>
+            <w:tcMar>
+              <w:top w:type="dxa" w:w="80"/>
+              <w:left w:type="dxa" w:w="110"/>
+              <w:bottom w:type="dxa" w:w="80"/>
+              <w:right w:type="dxa" w:w="110"/>
+            </w:tcMar>
+          </w:tcPr>
+          <w:p>
+            <w:pPr>
+              <w:jc w:val="center"/>
+            </w:pPr>
+            <w:r>
+              <w:rPr>
+                <w:b/>
+                <w:bCs/>
+                <w:sz w:val="20"/>
+                <w:szCs w:val="20"/>
+              </w:rPr>
+              <w:t xml:space="preserve">1</w:t>
+            </w:r>
+          </w:p>
+        </w:tc>
+        <w:tc>
+          <w:tcPr>
+            <w:tcW w:type="dxa" w:w="4700"/>
+            <w:tcBorders>
+              <w:top w:val="single" w:color="D0D7DE" w:sz="4"/>
+              <w:left w:val="single" w:color="D0D7DE" w:sz="4"/>
+              <w:bottom w:val="single" w:color="D0D7DE" w:sz="4"/>
+              <w:right w:val="single" w:color="D0D7DE" w:sz="4"/>
+            </w:tcBorders>
+            <w:shd w:fill="FFFFFF" w:color="auto" w:val="clear"/>
+            <w:tcMar>
+              <w:top w:type="dxa" w:w="80"/>
+              <w:left w:type="dxa" w:w="110"/>
+              <w:bottom w:type="dxa" w:w="80"/>
+              <w:right w:type="dxa" w:w="110"/>
+            </w:tcMar>
+          </w:tcPr>
+          <w:p>
+            <w:pPr>
+              <w:jc w:val="left"/>
+            </w:pPr>
+            <w:r>
+              <w:rPr>
+                <w:b w:val="false"/>
+                <w:bCs w:val="false"/>
+                <w:sz w:val="20"/>
+                <w:szCs w:val="20"/>
+              </w:rPr>
+              <w:t xml:space="preserve">Click your name at the top right, then Resignation.</w:t>
+            </w:r>
+          </w:p>
+        </w:tc>
+        <w:tc>
+          <w:tcPr>
+            <w:tcW w:type="dxa" w:w="3526"/>
+            <w:tcBorders>
+              <w:top w:val="single" w:color="D0D7DE" w:sz="4"/>
+              <w:left w:val="single" w:color="D0D7DE" w:sz="4"/>
+              <w:bottom w:val="single" w:color="D0D7DE" w:sz="4"/>
+              <w:right w:val="single" w:color="D0D7DE" w:sz="4"/>
+            </w:tcBorders>
+            <w:shd w:fill="FFFFFF" w:color="auto" w:val="clear"/>
+            <w:tcMar>
+              <w:top w:type="dxa" w:w="80"/>
+              <w:left w:type="dxa" w:w="110"/>
+              <w:bottom w:type="dxa" w:w="80"/>
+              <w:right w:type="dxa" w:w="110"/>
+            </w:tcMar>
+          </w:tcPr>
+          <w:p>
+            <w:pPr>
+              <w:jc w:val="left"/>
+            </w:pPr>
+            <w:r>
+              <w:rPr>
+                <w:b w:val="false"/>
+                <w:bCs w:val="false"/>
+                <w:sz w:val="20"/>
+                <w:szCs w:val="20"/>
+              </w:rPr>
+              <w:t xml:space="preserve">The Resign form. The notice period is 30 days.</w:t>
+            </w:r>
+          </w:p>
+        </w:tc>
+      </w:tr>
+      <w:tr>
+        <w:trPr>
+          <w:cantSplit/>
+        </w:trPr>
+        <w:tc>
+          <w:tcPr>
+            <w:tcW w:type="dxa" w:w="800"/>
+            <w:tcBorders>
+              <w:top w:val="single" w:color="D0D7DE" w:sz="4"/>
+              <w:left w:val="single" w:color="D0D7DE" w:sz="4"/>
+              <w:bottom w:val="single" w:color="D0D7DE" w:sz="4"/>
+              <w:right w:val="single" w:color="D0D7DE" w:sz="4"/>
+            </w:tcBorders>
+            <w:shd w:fill="F4F6F8" w:color="auto" w:val="clear"/>
+            <w:tcMar>
+              <w:top w:type="dxa" w:w="80"/>
+              <w:left w:type="dxa" w:w="110"/>
+              <w:bottom w:type="dxa" w:w="80"/>
+              <w:right w:type="dxa" w:w="110"/>
+            </w:tcMar>
+          </w:tcPr>
+          <w:p>
+            <w:pPr>
+              <w:jc w:val="center"/>
+            </w:pPr>
+            <w:r>
+              <w:rPr>
+                <w:b/>
+                <w:bCs/>
+                <w:sz w:val="20"/>
+                <w:szCs w:val="20"/>
+              </w:rPr>
+              <w:t xml:space="preserve">2</w:t>
+            </w:r>
+          </w:p>
+        </w:tc>
+        <w:tc>
+          <w:tcPr>
+            <w:tcW w:type="dxa" w:w="4700"/>
+            <w:tcBorders>
+              <w:top w:val="single" w:color="D0D7DE" w:sz="4"/>
+              <w:left w:val="single" w:color="D0D7DE" w:sz="4"/>
+              <w:bottom w:val="single" w:color="D0D7DE" w:sz="4"/>
+              <w:right w:val="single" w:color="D0D7DE" w:sz="4"/>
+            </w:tcBorders>
+            <w:shd w:fill="F4F6F8" w:color="auto" w:val="clear"/>
+            <w:tcMar>
+              <w:top w:type="dxa" w:w="80"/>
+              <w:left w:type="dxa" w:w="110"/>
+              <w:bottom w:type="dxa" w:w="80"/>
+              <w:right w:type="dxa" w:w="110"/>
+            </w:tcMar>
+          </w:tcPr>
+          <w:p>
+            <w:pPr>
+              <w:jc w:val="left"/>
+            </w:pPr>
+            <w:r>
+              <w:rPr>
+                <w:b w:val="false"/>
+                <w:bCs w:val="false"/>
+                <w:sz w:val="20"/>
+                <w:szCs w:val="20"/>
+              </w:rPr>
+              <w:t xml:space="preserve">Pick your requested last working day. The form suggests today plus 30 days; you can ask for an earlier day.</w:t>
+            </w:r>
+          </w:p>
+        </w:tc>
+        <w:tc>
+          <w:tcPr>
+            <w:tcW w:type="dxa" w:w="3526"/>
+            <w:tcBorders>
+              <w:top w:val="single" w:color="D0D7DE" w:sz="4"/>
+              <w:left w:val="single" w:color="D0D7DE" w:sz="4"/>
+              <w:bottom w:val="single" w:color="D0D7DE" w:sz="4"/>
+              <w:right w:val="single" w:color="D0D7DE" w:sz="4"/>
+            </w:tcBorders>
+            <w:shd w:fill="F4F6F8" w:color="auto" w:val="clear"/>
+            <w:tcMar>
+              <w:top w:type="dxa" w:w="80"/>
+              <w:left w:type="dxa" w:w="110"/>
+              <w:bottom w:type="dxa" w:w="80"/>
+              <w:right w:type="dxa" w:w="110"/>
+            </w:tcMar>
+          </w:tcPr>
+          <w:p>
+            <w:pPr>
+              <w:jc w:val="left"/>
+            </w:pPr>
+            <w:r>
+              <w:rPr>
+                <w:b w:val="false"/>
+                <w:bCs w:val="false"/>
+                <w:sz w:val="20"/>
+                <w:szCs w:val="20"/>
+              </w:rPr>
+              <w:t xml:space="preserve">The date is filled in.</w:t>
+            </w:r>
+          </w:p>
+        </w:tc>
+      </w:tr>
+      <w:tr>
+        <w:trPr>
+          <w:cantSplit/>
+        </w:trPr>
+        <w:tc>
+          <w:tcPr>
+            <w:tcW w:type="dxa" w:w="800"/>
+            <w:tcBorders>
+              <w:top w:val="single" w:color="D0D7DE" w:sz="4"/>
+              <w:left w:val="single" w:color="D0D7DE" w:sz="4"/>
+              <w:bottom w:val="single" w:color="D0D7DE" w:sz="4"/>
+              <w:right w:val="single" w:color="D0D7DE" w:sz="4"/>
+            </w:tcBorders>
+            <w:shd w:fill="FFFFFF" w:color="auto" w:val="clear"/>
+            <w:tcMar>
+              <w:top w:type="dxa" w:w="80"/>
+              <w:left w:type="dxa" w:w="110"/>
+              <w:bottom w:type="dxa" w:w="80"/>
+              <w:right w:type="dxa" w:w="110"/>
+            </w:tcMar>
+          </w:tcPr>
+          <w:p>
+            <w:pPr>
+              <w:jc w:val="center"/>
+            </w:pPr>
+            <w:r>
+              <w:rPr>
+                <w:b/>
+                <w:bCs/>
+                <w:sz w:val="20"/>
+                <w:szCs w:val="20"/>
+              </w:rPr>
+              <w:t xml:space="preserve">3</w:t>
+            </w:r>
+          </w:p>
+        </w:tc>
+        <w:tc>
+          <w:tcPr>
+            <w:tcW w:type="dxa" w:w="4700"/>
+            <w:tcBorders>
+              <w:top w:val="single" w:color="D0D7DE" w:sz="4"/>
+              <w:left w:val="single" w:color="D0D7DE" w:sz="4"/>
+              <w:bottom w:val="single" w:color="D0D7DE" w:sz="4"/>
+              <w:right w:val="single" w:color="D0D7DE" w:sz="4"/>
+            </w:tcBorders>
+            <w:shd w:fill="FFFFFF" w:color="auto" w:val="clear"/>
+            <w:tcMar>
+              <w:top w:type="dxa" w:w="80"/>
+              <w:left w:type="dxa" w:w="110"/>
+              <w:bottom w:type="dxa" w:w="80"/>
+              <w:right w:type="dxa" w:w="110"/>
+            </w:tcMar>
+          </w:tcPr>
+          <w:p>
+            <w:pPr>
+              <w:jc w:val="left"/>
+            </w:pPr>
+            <w:r>
+              <w:rPr>
+                <w:b w:val="false"/>
+                <w:bCs w:val="false"/>
+                <w:sz w:val="20"/>
+                <w:szCs w:val="20"/>
+              </w:rPr>
+              <w:t xml:space="preserve">Type your reason, then click Submit resignation.</w:t>
+            </w:r>
+          </w:p>
+        </w:tc>
+        <w:tc>
+          <w:tcPr>
+            <w:tcW w:type="dxa" w:w="3526"/>
+            <w:tcBorders>
+              <w:top w:val="single" w:color="D0D7DE" w:sz="4"/>
+              <w:left w:val="single" w:color="D0D7DE" w:sz="4"/>
+              <w:bottom w:val="single" w:color="D0D7DE" w:sz="4"/>
+              <w:right w:val="single" w:color="D0D7DE" w:sz="4"/>
+            </w:tcBorders>
+            <w:shd w:fill="FFFFFF" w:color="auto" w:val="clear"/>
+            <w:tcMar>
+              <w:top w:type="dxa" w:w="80"/>
+              <w:left w:type="dxa" w:w="110"/>
+              <w:bottom w:type="dxa" w:w="80"/>
+              <w:right w:type="dxa" w:w="110"/>
+            </w:tcMar>
+          </w:tcPr>
+          <w:p>
+            <w:pPr>
+              <w:jc w:val="left"/>
+            </w:pPr>
+            <w:r>
+              <w:rPr>
+                <w:b w:val="false"/>
+                <w:bCs w:val="false"/>
+                <w:sz w:val="20"/>
+                <w:szCs w:val="20"/>
+              </w:rPr>
+              <w:t xml:space="preserve">It shows Waiting for HR. Your manager and HR get an email.</w:t>
+            </w:r>
+          </w:p>
+        </w:tc>
+      </w:tr>
+      <w:tr>
+        <w:trPr>
+          <w:cantSplit/>
+        </w:trPr>
+        <w:tc>
+          <w:tcPr>
+            <w:tcW w:type="dxa" w:w="800"/>
+            <w:tcBorders>
+              <w:top w:val="single" w:color="D0D7DE" w:sz="4"/>
+              <w:left w:val="single" w:color="D0D7DE" w:sz="4"/>
+              <w:bottom w:val="single" w:color="D0D7DE" w:sz="4"/>
+              <w:right w:val="single" w:color="D0D7DE" w:sz="4"/>
+            </w:tcBorders>
+            <w:shd w:fill="F4F6F8" w:color="auto" w:val="clear"/>
+            <w:tcMar>
+              <w:top w:type="dxa" w:w="80"/>
+              <w:left w:type="dxa" w:w="110"/>
+              <w:bottom w:type="dxa" w:w="80"/>
+              <w:right w:type="dxa" w:w="110"/>
+            </w:tcMar>
+          </w:tcPr>
+          <w:p>
+            <w:pPr>
+              <w:jc w:val="center"/>
+            </w:pPr>
+            <w:r>
+              <w:rPr>
+                <w:b/>
+                <w:bCs/>
+                <w:sz w:val="20"/>
+                <w:szCs w:val="20"/>
+              </w:rPr>
+              <w:t xml:space="preserve">4</w:t>
+            </w:r>
+          </w:p>
+        </w:tc>
+        <w:tc>
+          <w:tcPr>
+            <w:tcW w:type="dxa" w:w="4700"/>
+            <w:tcBorders>
+              <w:top w:val="single" w:color="D0D7DE" w:sz="4"/>
+              <w:left w:val="single" w:color="D0D7DE" w:sz="4"/>
+              <w:bottom w:val="single" w:color="D0D7DE" w:sz="4"/>
+              <w:right w:val="single" w:color="D0D7DE" w:sz="4"/>
+            </w:tcBorders>
+            <w:shd w:fill="F4F6F8" w:color="auto" w:val="clear"/>
+            <w:tcMar>
+              <w:top w:type="dxa" w:w="80"/>
+              <w:left w:type="dxa" w:w="110"/>
+              <w:bottom w:type="dxa" w:w="80"/>
+              <w:right w:type="dxa" w:w="110"/>
+            </w:tcMar>
+          </w:tcPr>
+          <w:p>
+            <w:pPr>
+              <w:jc w:val="left"/>
+            </w:pPr>
+            <w:r>
+              <w:rPr>
+                <w:b w:val="false"/>
+                <w:bCs w:val="false"/>
+                <w:sz w:val="20"/>
+                <w:szCs w:val="20"/>
+              </w:rPr>
+              <w:t xml:space="preserve">Changed your mind? Click Withdraw resignation.</w:t>
+            </w:r>
+          </w:p>
+        </w:tc>
+        <w:tc>
+          <w:tcPr>
+            <w:tcW w:type="dxa" w:w="3526"/>
+            <w:tcBorders>
+              <w:top w:val="single" w:color="D0D7DE" w:sz="4"/>
+              <w:left w:val="single" w:color="D0D7DE" w:sz="4"/>
+              <w:bottom w:val="single" w:color="D0D7DE" w:sz="4"/>
+              <w:right w:val="single" w:color="D0D7DE" w:sz="4"/>
+            </w:tcBorders>
+            <w:shd w:fill="F4F6F8" w:color="auto" w:val="clear"/>
+            <w:tcMar>
+              <w:top w:type="dxa" w:w="80"/>
+              <w:left w:type="dxa" w:w="110"/>
+              <w:bottom w:type="dxa" w:w="80"/>
+              <w:right w:type="dxa" w:w="110"/>
+            </w:tcMar>
+          </w:tcPr>
+          <w:p>
+            <w:pPr>
+              <w:jc w:val="left"/>
+            </w:pPr>
+            <w:r>
+              <w:rPr>
+                <w:b w:val="false"/>
+                <w:bCs w:val="false"/>
+                <w:sz w:val="20"/>
+                <w:szCs w:val="20"/>
+              </w:rPr>
+              <w:t xml:space="preserve">It shows Withdrawn. You can only do this before HR decides.</w:t>
+            </w:r>
+          </w:p>
+        </w:tc>
+      </w:tr>
+      <w:tr>
+        <w:trPr>
+          <w:cantSplit/>
+        </w:trPr>
+        <w:tc>
+          <w:tcPr>
+            <w:tcW w:type="dxa" w:w="800"/>
+            <w:tcBorders>
+              <w:top w:val="single" w:color="D0D7DE" w:sz="4"/>
+              <w:left w:val="single" w:color="D0D7DE" w:sz="4"/>
+              <w:bottom w:val="single" w:color="D0D7DE" w:sz="4"/>
+              <w:right w:val="single" w:color="D0D7DE" w:sz="4"/>
+            </w:tcBorders>
+            <w:shd w:fill="FFFFFF" w:color="auto" w:val="clear"/>
+            <w:tcMar>
+              <w:top w:type="dxa" w:w="80"/>
+              <w:left w:type="dxa" w:w="110"/>
+              <w:bottom w:type="dxa" w:w="80"/>
+              <w:right w:type="dxa" w:w="110"/>
+            </w:tcMar>
+          </w:tcPr>
+          <w:p>
+            <w:pPr>
+              <w:jc w:val="center"/>
+            </w:pPr>
+            <w:r>
+              <w:rPr>
+                <w:b/>
+                <w:bCs/>
+                <w:sz w:val="20"/>
+                <w:szCs w:val="20"/>
+              </w:rPr>
+              <w:t xml:space="preserve">5</w:t>
+            </w:r>
+          </w:p>
+        </w:tc>
+        <w:tc>
+          <w:tcPr>
+            <w:tcW w:type="dxa" w:w="4700"/>
+            <w:tcBorders>
+              <w:top w:val="single" w:color="D0D7DE" w:sz="4"/>
+              <w:left w:val="single" w:color="D0D7DE" w:sz="4"/>
+              <w:bottom w:val="single" w:color="D0D7DE" w:sz="4"/>
+              <w:right w:val="single" w:color="D0D7DE" w:sz="4"/>
+            </w:tcBorders>
+            <w:shd w:fill="FFFFFF" w:color="auto" w:val="clear"/>
+            <w:tcMar>
+              <w:top w:type="dxa" w:w="80"/>
+              <w:left w:type="dxa" w:w="110"/>
+              <w:bottom w:type="dxa" w:w="80"/>
+              <w:right w:type="dxa" w:w="110"/>
+            </w:tcMar>
+          </w:tcPr>
+          <w:p>
+            <w:pPr>
+              <w:jc w:val="left"/>
+            </w:pPr>
+            <w:r>
+              <w:rPr>
+                <w:b w:val="false"/>
+                <w:bCs w:val="false"/>
+                <w:sz w:val="20"/>
+                <w:szCs w:val="20"/>
+              </w:rPr>
+              <w:t xml:space="preserve">Wait for HR.</w:t>
+            </w:r>
+          </w:p>
+        </w:tc>
+        <w:tc>
+          <w:tcPr>
+            <w:tcW w:type="dxa" w:w="3526"/>
+            <w:tcBorders>
+              <w:top w:val="single" w:color="D0D7DE" w:sz="4"/>
+              <w:left w:val="single" w:color="D0D7DE" w:sz="4"/>
+              <w:bottom w:val="single" w:color="D0D7DE" w:sz="4"/>
+              <w:right w:val="single" w:color="D0D7DE" w:sz="4"/>
+            </w:tcBorders>
+            <w:shd w:fill="FFFFFF" w:color="auto" w:val="clear"/>
+            <w:tcMar>
+              <w:top w:type="dxa" w:w="80"/>
+              <w:left w:type="dxa" w:w="110"/>
+              <w:bottom w:type="dxa" w:w="80"/>
+              <w:right w:type="dxa" w:w="110"/>
+            </w:tcMar>
+          </w:tcPr>
+          <w:p>
+            <w:pPr>
+              <w:jc w:val="left"/>
+            </w:pPr>
+            <w:r>
+              <w:rPr>
+                <w:b w:val="false"/>
+                <w:bCs w:val="false"/>
+                <w:sz w:val="20"/>
+                <w:szCs w:val="20"/>
+              </w:rPr>
+              <w:t xml:space="preserve">Accepted: HR confirms your last working day by email. Declined: you see HR’s reason.</w:t>
+            </w:r>
+          </w:p>
+        </w:tc>
+      </w:tr>
+      <w:tr>
+        <w:trPr>
+          <w:cantSplit/>
+        </w:trPr>
+        <w:tc>
+          <w:tcPr>
+            <w:tcW w:type="dxa" w:w="800"/>
+            <w:tcBorders>
+              <w:top w:val="single" w:color="D0D7DE" w:sz="4"/>
+              <w:left w:val="single" w:color="D0D7DE" w:sz="4"/>
+              <w:bottom w:val="single" w:color="D0D7DE" w:sz="4"/>
+              <w:right w:val="single" w:color="D0D7DE" w:sz="4"/>
+            </w:tcBorders>
+            <w:shd w:fill="F4F6F8" w:color="auto" w:val="clear"/>
+            <w:tcMar>
+              <w:top w:type="dxa" w:w="80"/>
+              <w:left w:type="dxa" w:w="110"/>
+              <w:bottom w:type="dxa" w:w="80"/>
+              <w:right w:type="dxa" w:w="110"/>
+            </w:tcMar>
+          </w:tcPr>
+          <w:p>
+            <w:pPr>
+              <w:jc w:val="center"/>
+            </w:pPr>
+            <w:r>
+              <w:rPr>
+                <w:b/>
+                <w:bCs/>
+                <w:sz w:val="20"/>
+                <w:szCs w:val="20"/>
+              </w:rPr>
+              <w:t xml:space="preserve">6</w:t>
+            </w:r>
+          </w:p>
+        </w:tc>
+        <w:tc>
+          <w:tcPr>
+            <w:tcW w:type="dxa" w:w="4700"/>
+            <w:tcBorders>
+              <w:top w:val="single" w:color="D0D7DE" w:sz="4"/>
+              <w:left w:val="single" w:color="D0D7DE" w:sz="4"/>
+              <w:bottom w:val="single" w:color="D0D7DE" w:sz="4"/>
+              <w:right w:val="single" w:color="D0D7DE" w:sz="4"/>
+            </w:tcBorders>
+            <w:shd w:fill="F4F6F8" w:color="auto" w:val="clear"/>
+            <w:tcMar>
+              <w:top w:type="dxa" w:w="80"/>
+              <w:left w:type="dxa" w:w="110"/>
+              <w:bottom w:type="dxa" w:w="80"/>
+              <w:right w:type="dxa" w:w="110"/>
+            </w:tcMar>
+          </w:tcPr>
+          <w:p>
+            <w:pPr>
+              <w:jc w:val="left"/>
+            </w:pPr>
+            <w:r>
+              <w:rPr>
+                <w:b w:val="false"/>
+                <w:bCs w:val="false"/>
+                <w:sz w:val="20"/>
+                <w:szCs w:val="20"/>
+              </w:rPr>
+              <w:t xml:space="preserve">After acceptance, keep working as usual.</w:t>
+            </w:r>
+          </w:p>
+        </w:tc>
+        <w:tc>
+          <w:tcPr>
+            <w:tcW w:type="dxa" w:w="3526"/>
+            <w:tcBorders>
+              <w:top w:val="single" w:color="D0D7DE" w:sz="4"/>
+              <w:left w:val="single" w:color="D0D7DE" w:sz="4"/>
+              <w:bottom w:val="single" w:color="D0D7DE" w:sz="4"/>
+              <w:right w:val="single" w:color="D0D7DE" w:sz="4"/>
+            </w:tcBorders>
+            <w:shd w:fill="F4F6F8" w:color="auto" w:val="clear"/>
+            <w:tcMar>
+              <w:top w:type="dxa" w:w="80"/>
+              <w:left w:type="dxa" w:w="110"/>
+              <w:bottom w:type="dxa" w:w="80"/>
+              <w:right w:type="dxa" w:w="110"/>
+            </w:tcMar>
+          </w:tcPr>
+          <w:p>
+            <w:pPr>
+              <w:jc w:val="left"/>
+            </w:pPr>
+            <w:r>
+              <w:rPr>
+                <w:b w:val="false"/>
+                <w:bCs w:val="false"/>
+                <w:sz w:val="20"/>
+                <w:szCs w:val="20"/>
+              </w:rPr>
+              <w:t xml:space="preserve">Attendance, leave and payslips carry on up to your last working day.</w:t>
+            </w:r>
+          </w:p>
+        </w:tc>
+      </w:tr>
+      <w:tr>
+        <w:trPr>
+          <w:cantSplit/>
+        </w:trPr>
+        <w:tc>
+          <w:tcPr>
+            <w:tcW w:type="dxa" w:w="800"/>
+            <w:tcBorders>
+              <w:top w:val="single" w:color="D0D7DE" w:sz="4"/>
+              <w:left w:val="single" w:color="D0D7DE" w:sz="4"/>
+              <w:bottom w:val="single" w:color="D0D7DE" w:sz="4"/>
+              <w:right w:val="single" w:color="D0D7DE" w:sz="4"/>
+            </w:tcBorders>
+            <w:shd w:fill="FFFFFF" w:color="auto" w:val="clear"/>
+            <w:tcMar>
+              <w:top w:type="dxa" w:w="80"/>
+              <w:left w:type="dxa" w:w="110"/>
+              <w:bottom w:type="dxa" w:w="80"/>
+              <w:right w:type="dxa" w:w="110"/>
+            </w:tcMar>
+          </w:tcPr>
+          <w:p>
+            <w:pPr>
+              <w:jc w:val="center"/>
+            </w:pPr>
+            <w:r>
+              <w:rPr>
+                <w:b/>
+                <w:bCs/>
+                <w:sz w:val="20"/>
+                <w:szCs w:val="20"/>
+              </w:rPr>
+              <w:t xml:space="preserve">7</w:t>
+            </w:r>
+          </w:p>
+        </w:tc>
+        <w:tc>
+          <w:tcPr>
+            <w:tcW w:type="dxa" w:w="4700"/>
+            <w:tcBorders>
+              <w:top w:val="single" w:color="D0D7DE" w:sz="4"/>
+              <w:left w:val="single" w:color="D0D7DE" w:sz="4"/>
+              <w:bottom w:val="single" w:color="D0D7DE" w:sz="4"/>
+              <w:right w:val="single" w:color="D0D7DE" w:sz="4"/>
+            </w:tcBorders>
+            <w:shd w:fill="FFFFFF" w:color="auto" w:val="clear"/>
+            <w:tcMar>
+              <w:top w:type="dxa" w:w="80"/>
+              <w:left w:type="dxa" w:w="110"/>
+              <w:bottom w:type="dxa" w:w="80"/>
+              <w:right w:type="dxa" w:w="110"/>
+            </w:tcMar>
+          </w:tcPr>
+          <w:p>
+            <w:pPr>
+              <w:jc w:val="left"/>
+            </w:pPr>
+            <w:r>
+              <w:rPr>
+                <w:b w:val="false"/>
+                <w:bCs w:val="false"/>
+                <w:sz w:val="20"/>
+                <w:szCs w:val="20"/>
+              </w:rPr>
+              <w:t xml:space="preserve">The night after your last working day.</w:t>
+            </w:r>
+          </w:p>
+        </w:tc>
+        <w:tc>
+          <w:tcPr>
+            <w:tcW w:type="dxa" w:w="3526"/>
+            <w:tcBorders>
+              <w:top w:val="single" w:color="D0D7DE" w:sz="4"/>
+              <w:left w:val="single" w:color="D0D7DE" w:sz="4"/>
+              <w:bottom w:val="single" w:color="D0D7DE" w:sz="4"/>
+              <w:right w:val="single" w:color="D0D7DE" w:sz="4"/>
+            </w:tcBorders>
+            <w:shd w:fill="FFFFFF" w:color="auto" w:val="clear"/>
+            <w:tcMar>
+              <w:top w:type="dxa" w:w="80"/>
+              <w:left w:type="dxa" w:w="110"/>
+              <w:bottom w:type="dxa" w:w="80"/>
+              <w:right w:type="dxa" w:w="110"/>
+            </w:tcMar>
+          </w:tcPr>
+          <w:p>
+            <w:pPr>
+              <w:jc w:val="left"/>
+            </w:pPr>
+            <w:r>
+              <w:rPr>
+                <w:b w:val="false"/>
+                <w:bCs w:val="false"/>
+                <w:sz w:val="20"/>
+                <w:szCs w:val="20"/>
+              </w:rPr>
+              <w:t xml:space="preserve">You have left the company and your sign-in is switched off.</w:t>
+            </w:r>
+          </w:p>
+        </w:tc>
+      </w:tr>
+    </w:tbl>
+    <w:p>
+      <w:pPr>
+        <w:pBdr>
+          <w:left w:val="single" w:color="C98A1B" w:sz="18" w:space="6"/>
+        </w:pBdr>
+        <w:shd w:fill="FFF6E6" w:color="auto" w:val="clear"/>
+        <w:spacing w:after="120" w:before="120"/>
+      </w:pPr>
+      <w:r>
+        <w:rPr>
+          <w:b/>
+          <w:bCs/>
+          <w:color w:val="8A4B00"/>
+        </w:rPr>
+        <w:t xml:space="preserve">Good to know:  </w:t>
+      </w:r>
+      <w:r>
+        <w:t xml:space="preserve">You can have only one resignation in progress. After acceptance, leave after your last working day is cancelled and can’t be requested, and your last payslip covers the days up to that day. To change an accepted date, talk to HR.</w:t>
+      </w:r>
+    </w:p>
+    <w:p>
+      <w:pPr>
+        <w:pStyle w:val="Heading1"/>
+        <w:pageBreakBefore/>
+      </w:pPr>
+      <w:r>
+        <w:t xml:space="preserve">9. Notifications, password and signing out</w:t>
+      </w:r>
+    </w:p>
+    <w:p>
+      <w:pPr>
+        <w:pBdr>
+          <w:left w:val="single" w:color="1F4E79" w:sz="18" w:space="6"/>
+        </w:pBdr>
+        <w:shd w:fill="EEF3F8" w:color="auto" w:val="clear"/>
+        <w:spacing w:after="120" w:before="120"/>
+      </w:pPr>
+      <w:r>
+        <w:rPr>
+          <w:b/>
+          <w:bCs/>
+          <w:color w:val="1F4E79"/>
+        </w:rPr>
+        <w:t xml:space="preserve">Before you start:  </w:t>
+      </w:r>
+      <w:r>
+        <w:t xml:space="preserve">Nothing.</w:t>
+      </w:r>
+    </w:p>
+    <w:p>
+      <w:pPr>
+        <w:spacing w:after="160" w:before="120"/>
+        <w:jc w:val="center"/>
+      </w:pPr>
+      <w:r>
+        <w:drawing>
+          <wp:inline distT="0" distB="0" distL="0" distR="0">
+            <wp:extent cx="5715000" cy="4362450"/>
+            <wp:effectExtent t="0" r="0" b="0" l="0"/>
+            <wp:docPr id="9" name="" descr="" title=""/>
+            <wp:cNvGraphicFramePr>
+              <a:graphicFrameLocks xmlns:a="http://schemas.openxmlformats.org/drawingml/2006/main" noChangeAspect="1"/>
+            </wp:cNvGraphicFramePr>
+            <a:graphic xmlns:a="http://schemas.openxmlformats.org/drawingml/2006/main">
+              <a:graphicData uri="http://schemas.openxmlformats.org/drawingml/2006/picture">
+                <pic:pic xmlns:pic="http://schemas.openxmlformats.org/drawingml/2006/picture">
+                  <pic:nvPicPr>
+                    <pic:cNvPr id="0" name="" descr=""/>
+                    <pic:cNvPicPr>
+                      <a:picLocks noChangeAspect="1" noChangeArrowheads="1"/>
+                    </pic:cNvPicPr>
+                  </pic:nvPicPr>
+                  <pic:blipFill>
+                    <a:blip r:embed="rId16" cstate="none"/>
                     <a:srcRect/>
                     <a:stretch>
                       <a:fillRect/>

</xml_diff>